<commit_message>
CRMZ: Presentacion Ejecutiva del Proyecto Final
</commit_message>
<xml_diff>
--- a/docs/Documento_Tecnico_Agentic_AI.docx
+++ b/docs/Documento_Tecnico_Agentic_AI.docx
@@ -4585,6 +4585,7 @@
         <w:rPr>
           <w:i/>
           <w:iCs/>
+          <w:noProof/>
           <w:color w:val="888888"/>
           <w:sz w:val="20"/>
           <w:szCs w:val="20"/>
@@ -4697,6 +4698,9 @@
         <w:pStyle w:val="Ttulo1"/>
       </w:pPr>
       <w:r>
+        <w:rPr>
+          <w:noProof/>
+        </w:rPr>
         <w:drawing>
           <wp:inline distT="0" distB="0" distL="0" distR="0" wp14:anchorId="56615A51" wp14:editId="336A0098">
             <wp:extent cx="5943600" cy="2567305"/>
@@ -7534,6 +7538,9 @@
     </w:p>
     <w:p>
       <w:r>
+        <w:rPr>
+          <w:noProof/>
+        </w:rPr>
         <w:drawing>
           <wp:inline distT="0" distB="0" distL="0" distR="0" wp14:anchorId="48B2253B" wp14:editId="1CF128AB">
             <wp:extent cx="5943600" cy="3644900"/>
@@ -13557,7 +13564,7 @@
           <w:noProof/>
         </w:rPr>
         <w:pict w14:anchorId="18F4840D">
-          <v:rect id="_x0000_i1034" alt="" style="width:425.2pt;height:.05pt;mso-width-percent:0;mso-height-percent:0;mso-width-percent:0;mso-height-percent:0" o:hralign="center" o:hrstd="t" o:hr="t" fillcolor="#a0a0a0" stroked="f"/>
+          <v:rect id="_x0000_i1025" alt="" style="width:425.2pt;height:.05pt;mso-width-percent:0;mso-height-percent:0;mso-width-percent:0;mso-height-percent:0" o:hralign="center" o:hrstd="t" o:hr="t" fillcolor="#a0a0a0" stroked="f"/>
         </w:pict>
       </w:r>
     </w:p>
@@ -13672,7 +13679,7 @@
           <w:noProof/>
         </w:rPr>
         <w:pict w14:anchorId="3751D2FE">
-          <v:rect id="_x0000_i1035" alt="" style="width:425.2pt;height:.05pt;mso-width-percent:0;mso-height-percent:0;mso-width-percent:0;mso-height-percent:0" o:hralign="center" o:hrstd="t" o:hr="t" fillcolor="#a0a0a0" stroked="f"/>
+          <v:rect id="_x0000_i1026" alt="" style="width:425.2pt;height:.05pt;mso-width-percent:0;mso-height-percent:0;mso-width-percent:0;mso-height-percent:0" o:hralign="center" o:hrstd="t" o:hr="t" fillcolor="#a0a0a0" stroked="f"/>
         </w:pict>
       </w:r>
     </w:p>
@@ -14201,7 +14208,7 @@
           <w:noProof/>
         </w:rPr>
         <w:pict w14:anchorId="6AC9E58B">
-          <v:rect id="_x0000_i1036" alt="" style="width:425.2pt;height:.05pt;mso-width-percent:0;mso-height-percent:0;mso-width-percent:0;mso-height-percent:0" o:hralign="center" o:hrstd="t" o:hr="t" fillcolor="#a0a0a0" stroked="f"/>
+          <v:rect id="_x0000_i1027" alt="" style="width:425.2pt;height:.05pt;mso-width-percent:0;mso-height-percent:0;mso-width-percent:0;mso-height-percent:0" o:hralign="center" o:hrstd="t" o:hr="t" fillcolor="#a0a0a0" stroked="f"/>
         </w:pict>
       </w:r>
     </w:p>
@@ -14443,7 +14450,7 @@
           <w:noProof/>
         </w:rPr>
         <w:pict w14:anchorId="35A6EA7E">
-          <v:rect id="_x0000_i1037" alt="" style="width:425.2pt;height:.05pt;mso-width-percent:0;mso-height-percent:0;mso-width-percent:0;mso-height-percent:0" o:hralign="center" o:hrstd="t" o:hr="t" fillcolor="#a0a0a0" stroked="f"/>
+          <v:rect id="_x0000_i1028" alt="" style="width:425.2pt;height:.05pt;mso-width-percent:0;mso-height-percent:0;mso-width-percent:0;mso-height-percent:0" o:hralign="center" o:hrstd="t" o:hr="t" fillcolor="#a0a0a0" stroked="f"/>
         </w:pict>
       </w:r>
     </w:p>
@@ -14502,7 +14509,7 @@
           <w:noProof/>
         </w:rPr>
         <w:pict w14:anchorId="19BBFE8D">
-          <v:rect id="_x0000_i1038" alt="" style="width:425.2pt;height:.05pt;mso-width-percent:0;mso-height-percent:0;mso-width-percent:0;mso-height-percent:0" o:hralign="center" o:hrstd="t" o:hr="t" fillcolor="#a0a0a0" stroked="f"/>
+          <v:rect id="_x0000_i1029" alt="" style="width:425.2pt;height:.05pt;mso-width-percent:0;mso-height-percent:0;mso-width-percent:0;mso-height-percent:0" o:hralign="center" o:hrstd="t" o:hr="t" fillcolor="#a0a0a0" stroked="f"/>
         </w:pict>
       </w:r>
     </w:p>
@@ -14557,7 +14564,7 @@
           <w:noProof/>
         </w:rPr>
         <w:pict w14:anchorId="7CB6BA72">
-          <v:rect id="_x0000_i1039" alt="" style="width:425.2pt;height:.05pt;mso-width-percent:0;mso-height-percent:0;mso-width-percent:0;mso-height-percent:0" o:hralign="center" o:hrstd="t" o:hr="t" fillcolor="#a0a0a0" stroked="f"/>
+          <v:rect id="_x0000_i1030" alt="" style="width:425.2pt;height:.05pt;mso-width-percent:0;mso-height-percent:0;mso-width-percent:0;mso-height-percent:0" o:hralign="center" o:hrstd="t" o:hr="t" fillcolor="#a0a0a0" stroked="f"/>
         </w:pict>
       </w:r>
     </w:p>
@@ -15049,7 +15056,7 @@
           <w:noProof/>
         </w:rPr>
         <w:pict w14:anchorId="492D7C4A">
-          <v:rect id="_x0000_i1040" alt="" style="width:425.2pt;height:.05pt;mso-width-percent:0;mso-height-percent:0;mso-width-percent:0;mso-height-percent:0" o:hralign="center" o:hrstd="t" o:hr="t" fillcolor="#a0a0a0" stroked="f"/>
+          <v:rect id="_x0000_i1031" alt="" style="width:425.2pt;height:.05pt;mso-width-percent:0;mso-height-percent:0;mso-width-percent:0;mso-height-percent:0" o:hralign="center" o:hrstd="t" o:hr="t" fillcolor="#a0a0a0" stroked="f"/>
         </w:pict>
       </w:r>
     </w:p>
@@ -15097,7 +15104,7 @@
           <w:noProof/>
         </w:rPr>
         <w:pict w14:anchorId="10F05FA9">
-          <v:rect id="_x0000_i1041" alt="" style="width:425.2pt;height:.05pt;mso-width-percent:0;mso-height-percent:0;mso-width-percent:0;mso-height-percent:0" o:hralign="center" o:hrstd="t" o:hr="t" fillcolor="#a0a0a0" stroked="f"/>
+          <v:rect id="_x0000_i1032" alt="" style="width:425.2pt;height:.05pt;mso-width-percent:0;mso-height-percent:0;mso-width-percent:0;mso-height-percent:0" o:hralign="center" o:hrstd="t" o:hr="t" fillcolor="#a0a0a0" stroked="f"/>
         </w:pict>
       </w:r>
     </w:p>
@@ -15145,7 +15152,7 @@
           <w:noProof/>
         </w:rPr>
         <w:pict w14:anchorId="433E24F9">
-          <v:rect id="_x0000_i1042" alt="" style="width:425.2pt;height:.05pt;mso-width-percent:0;mso-height-percent:0;mso-width-percent:0;mso-height-percent:0" o:hralign="center" o:hrstd="t" o:hr="t" fillcolor="#a0a0a0" stroked="f"/>
+          <v:rect id="_x0000_i1033" alt="" style="width:425.2pt;height:.05pt;mso-width-percent:0;mso-height-percent:0;mso-width-percent:0;mso-height-percent:0" o:hralign="center" o:hrstd="t" o:hr="t" fillcolor="#a0a0a0" stroked="f"/>
         </w:pict>
       </w:r>
     </w:p>
@@ -15412,7 +15419,7 @@
           <w:noProof/>
         </w:rPr>
         <w:pict w14:anchorId="46F94626">
-          <v:rect id="_x0000_i1052" alt="" style="width:425.2pt;height:.05pt;mso-width-percent:0;mso-height-percent:0;mso-width-percent:0;mso-height-percent:0" o:hralign="center" o:hrstd="t" o:hr="t" fillcolor="#a0a0a0" stroked="f"/>
+          <v:rect id="_x0000_i1034" alt="" style="width:425.2pt;height:.05pt;mso-width-percent:0;mso-height-percent:0;mso-width-percent:0;mso-height-percent:0" o:hralign="center" o:hrstd="t" o:hr="t" fillcolor="#a0a0a0" stroked="f"/>
         </w:pict>
       </w:r>
     </w:p>
@@ -15527,7 +15534,7 @@
           <w:noProof/>
         </w:rPr>
         <w:pict w14:anchorId="2E79BA26">
-          <v:rect id="_x0000_i1053" alt="" style="width:425.2pt;height:.05pt;mso-width-percent:0;mso-height-percent:0;mso-width-percent:0;mso-height-percent:0" o:hralign="center" o:hrstd="t" o:hr="t" fillcolor="#a0a0a0" stroked="f"/>
+          <v:rect id="_x0000_i1035" alt="" style="width:425.2pt;height:.05pt;mso-width-percent:0;mso-height-percent:0;mso-width-percent:0;mso-height-percent:0" o:hralign="center" o:hrstd="t" o:hr="t" fillcolor="#a0a0a0" stroked="f"/>
         </w:pict>
       </w:r>
     </w:p>
@@ -16056,7 +16063,7 @@
           <w:noProof/>
         </w:rPr>
         <w:pict w14:anchorId="2C8B2217">
-          <v:rect id="_x0000_i1054" alt="" style="width:425.2pt;height:.05pt;mso-width-percent:0;mso-height-percent:0;mso-width-percent:0;mso-height-percent:0" o:hralign="center" o:hrstd="t" o:hr="t" fillcolor="#a0a0a0" stroked="f"/>
+          <v:rect id="_x0000_i1036" alt="" style="width:425.2pt;height:.05pt;mso-width-percent:0;mso-height-percent:0;mso-width-percent:0;mso-height-percent:0" o:hralign="center" o:hrstd="t" o:hr="t" fillcolor="#a0a0a0" stroked="f"/>
         </w:pict>
       </w:r>
     </w:p>
@@ -16298,7 +16305,7 @@
           <w:noProof/>
         </w:rPr>
         <w:pict w14:anchorId="4740D759">
-          <v:rect id="_x0000_i1055" alt="" style="width:425.2pt;height:.05pt;mso-width-percent:0;mso-height-percent:0;mso-width-percent:0;mso-height-percent:0" o:hralign="center" o:hrstd="t" o:hr="t" fillcolor="#a0a0a0" stroked="f"/>
+          <v:rect id="_x0000_i1037" alt="" style="width:425.2pt;height:.05pt;mso-width-percent:0;mso-height-percent:0;mso-width-percent:0;mso-height-percent:0" o:hralign="center" o:hrstd="t" o:hr="t" fillcolor="#a0a0a0" stroked="f"/>
         </w:pict>
       </w:r>
     </w:p>
@@ -16357,7 +16364,7 @@
           <w:noProof/>
         </w:rPr>
         <w:pict w14:anchorId="10CDA37D">
-          <v:rect id="_x0000_i1056" alt="" style="width:425.2pt;height:.05pt;mso-width-percent:0;mso-height-percent:0;mso-width-percent:0;mso-height-percent:0" o:hralign="center" o:hrstd="t" o:hr="t" fillcolor="#a0a0a0" stroked="f"/>
+          <v:rect id="_x0000_i1038" alt="" style="width:425.2pt;height:.05pt;mso-width-percent:0;mso-height-percent:0;mso-width-percent:0;mso-height-percent:0" o:hralign="center" o:hrstd="t" o:hr="t" fillcolor="#a0a0a0" stroked="f"/>
         </w:pict>
       </w:r>
     </w:p>
@@ -16412,7 +16419,7 @@
           <w:noProof/>
         </w:rPr>
         <w:pict w14:anchorId="3DF39B92">
-          <v:rect id="_x0000_i1057" alt="" style="width:425.2pt;height:.05pt;mso-width-percent:0;mso-height-percent:0;mso-width-percent:0;mso-height-percent:0" o:hralign="center" o:hrstd="t" o:hr="t" fillcolor="#a0a0a0" stroked="f"/>
+          <v:rect id="_x0000_i1039" alt="" style="width:425.2pt;height:.05pt;mso-width-percent:0;mso-height-percent:0;mso-width-percent:0;mso-height-percent:0" o:hralign="center" o:hrstd="t" o:hr="t" fillcolor="#a0a0a0" stroked="f"/>
         </w:pict>
       </w:r>
     </w:p>
@@ -16904,7 +16911,7 @@
           <w:noProof/>
         </w:rPr>
         <w:pict w14:anchorId="4BB7E97A">
-          <v:rect id="_x0000_i1058" alt="" style="width:425.2pt;height:.05pt;mso-width-percent:0;mso-height-percent:0;mso-width-percent:0;mso-height-percent:0" o:hralign="center" o:hrstd="t" o:hr="t" fillcolor="#a0a0a0" stroked="f"/>
+          <v:rect id="_x0000_i1040" alt="" style="width:425.2pt;height:.05pt;mso-width-percent:0;mso-height-percent:0;mso-width-percent:0;mso-height-percent:0" o:hralign="center" o:hrstd="t" o:hr="t" fillcolor="#a0a0a0" stroked="f"/>
         </w:pict>
       </w:r>
     </w:p>
@@ -16952,7 +16959,7 @@
           <w:noProof/>
         </w:rPr>
         <w:pict w14:anchorId="249A2FEC">
-          <v:rect id="_x0000_i1059" alt="" style="width:425.2pt;height:.05pt;mso-width-percent:0;mso-height-percent:0;mso-width-percent:0;mso-height-percent:0" o:hralign="center" o:hrstd="t" o:hr="t" fillcolor="#a0a0a0" stroked="f"/>
+          <v:rect id="_x0000_i1041" alt="" style="width:425.2pt;height:.05pt;mso-width-percent:0;mso-height-percent:0;mso-width-percent:0;mso-height-percent:0" o:hralign="center" o:hrstd="t" o:hr="t" fillcolor="#a0a0a0" stroked="f"/>
         </w:pict>
       </w:r>
     </w:p>
@@ -17000,7 +17007,7 @@
           <w:noProof/>
         </w:rPr>
         <w:pict w14:anchorId="461160E5">
-          <v:rect id="_x0000_i1060" alt="" style="width:425.2pt;height:.05pt;mso-width-percent:0;mso-height-percent:0;mso-width-percent:0;mso-height-percent:0" o:hralign="center" o:hrstd="t" o:hr="t" fillcolor="#a0a0a0" stroked="f"/>
+          <v:rect id="_x0000_i1042" alt="" style="width:425.2pt;height:.05pt;mso-width-percent:0;mso-height-percent:0;mso-width-percent:0;mso-height-percent:0" o:hralign="center" o:hrstd="t" o:hr="t" fillcolor="#a0a0a0" stroked="f"/>
         </w:pict>
       </w:r>
     </w:p>
@@ -17119,7 +17126,7 @@
           <w:noProof/>
         </w:rPr>
         <w:pict w14:anchorId="770AEDDC">
-          <v:rect id="_x0000_i1061" alt="" style="width:425.2pt;height:.05pt;mso-width-percent:0;mso-height-percent:0;mso-width-percent:0;mso-height-percent:0" o:hralign="center" o:hrstd="t" o:hr="t" fillcolor="#a0a0a0" stroked="f"/>
+          <v:rect id="_x0000_i1043" alt="" style="width:425.2pt;height:.05pt;mso-width-percent:0;mso-height-percent:0;mso-width-percent:0;mso-height-percent:0" o:hralign="center" o:hrstd="t" o:hr="t" fillcolor="#a0a0a0" stroked="f"/>
         </w:pict>
       </w:r>
     </w:p>
@@ -17294,7 +17301,7 @@
           <w:noProof/>
         </w:rPr>
         <w:pict w14:anchorId="298385FA">
-          <v:rect id="_x0000_i1062" alt="" style="width:425.2pt;height:.05pt;mso-width-percent:0;mso-height-percent:0;mso-width-percent:0;mso-height-percent:0" o:hralign="center" o:hrstd="t" o:hr="t" fillcolor="#a0a0a0" stroked="f"/>
+          <v:rect id="_x0000_i1044" alt="" style="width:425.2pt;height:.05pt;mso-width-percent:0;mso-height-percent:0;mso-width-percent:0;mso-height-percent:0" o:hralign="center" o:hrstd="t" o:hr="t" fillcolor="#a0a0a0" stroked="f"/>
         </w:pict>
       </w:r>
     </w:p>
@@ -17507,7 +17514,7 @@
           <w:noProof/>
         </w:rPr>
         <w:pict w14:anchorId="5DFE81E1">
-          <v:rect id="_x0000_i1063" alt="" style="width:425.2pt;height:.05pt;mso-width-percent:0;mso-height-percent:0;mso-width-percent:0;mso-height-percent:0" o:hralign="center" o:hrstd="t" o:hr="t" fillcolor="#a0a0a0" stroked="f"/>
+          <v:rect id="_x0000_i1045" alt="" style="width:425.2pt;height:.05pt;mso-width-percent:0;mso-height-percent:0;mso-width-percent:0;mso-height-percent:0" o:hralign="center" o:hrstd="t" o:hr="t" fillcolor="#a0a0a0" stroked="f"/>
         </w:pict>
       </w:r>
     </w:p>
@@ -17714,7 +17721,7 @@
           <w:noProof/>
         </w:rPr>
         <w:pict w14:anchorId="58055A05">
-          <v:rect id="_x0000_i1064" alt="" style="width:425.2pt;height:.05pt;mso-width-percent:0;mso-height-percent:0;mso-width-percent:0;mso-height-percent:0" o:hralign="center" o:hrstd="t" o:hr="t" fillcolor="#a0a0a0" stroked="f"/>
+          <v:rect id="_x0000_i1046" alt="" style="width:425.2pt;height:.05pt;mso-width-percent:0;mso-height-percent:0;mso-width-percent:0;mso-height-percent:0" o:hralign="center" o:hrstd="t" o:hr="t" fillcolor="#a0a0a0" stroked="f"/>
         </w:pict>
       </w:r>
     </w:p>
@@ -17886,7 +17893,7 @@
           <w:noProof/>
         </w:rPr>
         <w:pict w14:anchorId="2AAE6F7B">
-          <v:rect id="_x0000_i1065" alt="" style="width:425.2pt;height:.05pt;mso-width-percent:0;mso-height-percent:0;mso-width-percent:0;mso-height-percent:0" o:hralign="center" o:hrstd="t" o:hr="t" fillcolor="#a0a0a0" stroked="f"/>
+          <v:rect id="_x0000_i1047" alt="" style="width:425.2pt;height:.05pt;mso-width-percent:0;mso-height-percent:0;mso-width-percent:0;mso-height-percent:0" o:hralign="center" o:hrstd="t" o:hr="t" fillcolor="#a0a0a0" stroked="f"/>
         </w:pict>
       </w:r>
     </w:p>
@@ -18015,7 +18022,7 @@
           <w:noProof/>
         </w:rPr>
         <w:pict w14:anchorId="31536C30">
-          <v:rect id="_x0000_i1066" alt="" style="width:425.2pt;height:.05pt;mso-width-percent:0;mso-height-percent:0;mso-width-percent:0;mso-height-percent:0" o:hralign="center" o:hrstd="t" o:hr="t" fillcolor="#a0a0a0" stroked="f"/>
+          <v:rect id="_x0000_i1048" alt="" style="width:425.2pt;height:.05pt;mso-width-percent:0;mso-height-percent:0;mso-width-percent:0;mso-height-percent:0" o:hralign="center" o:hrstd="t" o:hr="t" fillcolor="#a0a0a0" stroked="f"/>
         </w:pict>
       </w:r>
     </w:p>
@@ -18198,7 +18205,7 @@
           <w:noProof/>
         </w:rPr>
         <w:pict w14:anchorId="4D912ABF">
-          <v:rect id="_x0000_i1067" alt="" style="width:425.2pt;height:.05pt;mso-width-percent:0;mso-height-percent:0;mso-width-percent:0;mso-height-percent:0" o:hralign="center" o:hrstd="t" o:hr="t" fillcolor="#a0a0a0" stroked="f"/>
+          <v:rect id="_x0000_i1049" alt="" style="width:425.2pt;height:.05pt;mso-width-percent:0;mso-height-percent:0;mso-width-percent:0;mso-height-percent:0" o:hralign="center" o:hrstd="t" o:hr="t" fillcolor="#a0a0a0" stroked="f"/>
         </w:pict>
       </w:r>
     </w:p>
@@ -18341,7 +18348,7 @@
           <w:noProof/>
         </w:rPr>
         <w:pict w14:anchorId="09BC75E2">
-          <v:rect id="_x0000_i1068" alt="" style="width:425.2pt;height:.05pt;mso-width-percent:0;mso-height-percent:0;mso-width-percent:0;mso-height-percent:0" o:hralign="center" o:hrstd="t" o:hr="t" fillcolor="#a0a0a0" stroked="f"/>
+          <v:rect id="_x0000_i1050" alt="" style="width:425.2pt;height:.05pt;mso-width-percent:0;mso-height-percent:0;mso-width-percent:0;mso-height-percent:0" o:hralign="center" o:hrstd="t" o:hr="t" fillcolor="#a0a0a0" stroked="f"/>
         </w:pict>
       </w:r>
     </w:p>
@@ -18499,6 +18506,9 @@
         <w:jc w:val="both"/>
       </w:pPr>
       <w:r>
+        <w:rPr>
+          <w:noProof/>
+        </w:rPr>
         <w:drawing>
           <wp:inline distT="0" distB="0" distL="0" distR="0" wp14:anchorId="0C248546" wp14:editId="5281A4A5">
             <wp:extent cx="5943600" cy="3322955"/>
@@ -18542,6 +18552,9 @@
         <w:jc w:val="both"/>
       </w:pPr>
       <w:r>
+        <w:rPr>
+          <w:noProof/>
+        </w:rPr>
         <w:drawing>
           <wp:inline distT="0" distB="0" distL="0" distR="0" wp14:anchorId="7FD5BAEB" wp14:editId="32EC2DD6">
             <wp:extent cx="5943600" cy="4044315"/>
@@ -18585,6 +18598,9 @@
         <w:jc w:val="both"/>
       </w:pPr>
       <w:r>
+        <w:rPr>
+          <w:noProof/>
+        </w:rPr>
         <w:lastRenderedPageBreak/>
         <w:drawing>
           <wp:inline distT="0" distB="0" distL="0" distR="0" wp14:anchorId="18C4948F" wp14:editId="2FEF9433">
@@ -18629,6 +18645,9 @@
         <w:jc w:val="both"/>
       </w:pPr>
       <w:r>
+        <w:rPr>
+          <w:noProof/>
+        </w:rPr>
         <w:drawing>
           <wp:inline distT="0" distB="0" distL="0" distR="0" wp14:anchorId="0DA6BCCA" wp14:editId="6A934460">
             <wp:extent cx="5943600" cy="3749675"/>
@@ -18672,6 +18691,9 @@
         <w:jc w:val="both"/>
       </w:pPr>
       <w:r>
+        <w:rPr>
+          <w:noProof/>
+        </w:rPr>
         <w:lastRenderedPageBreak/>
         <w:drawing>
           <wp:inline distT="0" distB="0" distL="0" distR="0" wp14:anchorId="0F7AEBFB" wp14:editId="6EE23B20">
@@ -18725,6 +18747,9 @@
         <w:jc w:val="both"/>
       </w:pPr>
       <w:r>
+        <w:rPr>
+          <w:noProof/>
+        </w:rPr>
         <w:drawing>
           <wp:inline distT="0" distB="0" distL="0" distR="0" wp14:anchorId="2780F37A" wp14:editId="5220AE9A">
             <wp:extent cx="5943600" cy="3319780"/>
@@ -18780,6 +18805,9 @@
         <w:jc w:val="both"/>
       </w:pPr>
       <w:r>
+        <w:rPr>
+          <w:noProof/>
+        </w:rPr>
         <w:lastRenderedPageBreak/>
         <w:drawing>
           <wp:inline distT="0" distB="0" distL="0" distR="0" wp14:anchorId="4CB74ADD" wp14:editId="177DEB72">
@@ -18824,6 +18852,9 @@
         <w:jc w:val="both"/>
       </w:pPr>
       <w:r>
+        <w:rPr>
+          <w:noProof/>
+        </w:rPr>
         <w:drawing>
           <wp:inline distT="0" distB="0" distL="0" distR="0" wp14:anchorId="09A4E3AE" wp14:editId="1A15B3CC">
             <wp:extent cx="5308600" cy="2943551"/>
@@ -18867,6 +18898,9 @@
         <w:jc w:val="both"/>
       </w:pPr>
       <w:r>
+        <w:rPr>
+          <w:noProof/>
+        </w:rPr>
         <w:drawing>
           <wp:inline distT="0" distB="0" distL="0" distR="0" wp14:anchorId="7406BAAC" wp14:editId="408F4680">
             <wp:extent cx="4953000" cy="1925108"/>
@@ -18910,6 +18944,9 @@
         <w:jc w:val="both"/>
       </w:pPr>
       <w:r>
+        <w:rPr>
+          <w:noProof/>
+        </w:rPr>
         <w:lastRenderedPageBreak/>
         <w:drawing>
           <wp:inline distT="0" distB="0" distL="0" distR="0" wp14:anchorId="3904A4DB" wp14:editId="7A89558A">
@@ -18963,6 +19000,9 @@
         <w:jc w:val="both"/>
       </w:pPr>
       <w:r>
+        <w:rPr>
+          <w:noProof/>
+        </w:rPr>
         <w:drawing>
           <wp:inline distT="0" distB="0" distL="0" distR="0" wp14:anchorId="0F678FF7" wp14:editId="3F24770E">
             <wp:extent cx="5943600" cy="3415030"/>

</xml_diff>